<commit_message>
feat: lam lai UI - bang diem hai ben, nut bam, highlight luot di
- them the nguoi choi: vien sang theo mau khi den luot, so tran thang ben canh

- them bang diem (wins, draws), nut 'Choi lai' giu diem va nut 'Xoa diem'

- chuyen sang pygame.font.SysFont de co dau tieng Viet, fallback ve font mac dinh

- sua bo cuc: chu trong the khong con chong, dong trang thai khong de dong huong dan

- selftest: them kiem tra cong diem, bam nut, hover; sinh them anh bang diem

- cap nhat README, ghi chu thuat toan va file Word bao cao
</commit_message>
<xml_diff>
--- a/docs/Bai-8-TicTacToe.docx
+++ b/docs/Bai-8-TicTacToe.docx
@@ -142,6 +142,14 @@
       </w:pPr>
       <w:r>
         <w:t xml:space="preserve">Mọi thành phần trên màn hình đều được vẽ bằng các hàm hình học của pygame, không đọc bất kỳ tệp ảnh hay tệp font nào:</w:t>
+      </w:r>
+    </w:p>
+    <w:p>
+      <w:pPr>
+        <w:spacing w:after="120"/>
+      </w:pPr>
+      <w:r>
+        <w:t xml:space="preserve">Riêng chữ thì dùng pygame.font.SysFont để lấy font có sẵn của hệ điều hành (Segoe UI trên Windows). Lý do: font mặc định đi kèm pygame không có dấu tiếng Việt, render ra sẽ thành ô vuông. Nếu máy không tìm được font nào, chương trình tự lùi về pygame.font.Font(None, size).</w:t>
       </w:r>
     </w:p>
     <w:tbl>
@@ -2203,7 +2211,7 @@
                 <w:b w:val="false"/>
                 <w:bCs w:val="false"/>
               </w:rPr>
-              <w:t xml:space="preserve">draw_mark(surface, row, col, mark)</w:t>
+              <w:t xml:space="preserve">draw_mark(surface, center, mark)</w:t>
             </w:r>
           </w:p>
         </w:tc>
@@ -2232,7 +2240,7 @@
                 <w:b w:val="false"/>
                 <w:bCs w:val="false"/>
               </w:rPr>
-              <w:t xml:space="preserve">Vẽ quân X (hai nét chéo) hoặc O (hình tròn) bằng pygame.draw</w:t>
+              <w:t xml:space="preserve">Vẽ quân X (hai nét chéo) hoặc O (hình tròn rỗng) bằng pygame.draw</w:t>
             </w:r>
           </w:p>
         </w:tc>
@@ -2323,6 +2331,126 @@
                 <w:b w:val="false"/>
                 <w:bCs w:val="false"/>
               </w:rPr>
+              <w:t xml:space="preserve">TicTacToe._panel(mark, rect, is_active)</w:t>
+            </w:r>
+          </w:p>
+        </w:tc>
+        <w:tc>
+          <w:tcPr>
+            <w:tcW w:type="dxa" w:w="5226"/>
+            <w:tcBorders>
+              <w:top w:val="single" w:color="BFC7D1" w:sz="1"/>
+              <w:left w:val="single" w:color="BFC7D1" w:sz="1"/>
+              <w:bottom w:val="single" w:color="BFC7D1" w:sz="1"/>
+              <w:right w:val="single" w:color="BFC7D1" w:sz="1"/>
+            </w:tcBorders>
+            <w:tcMar>
+              <w:top w:type="dxa" w:w="80"/>
+              <w:left w:type="dxa" w:w="120"/>
+              <w:bottom w:type="dxa" w:w="80"/>
+              <w:right w:type="dxa" w:w="120"/>
+            </w:tcMar>
+          </w:tcPr>
+          <w:p>
+            <w:pPr>
+              <w:spacing w:after="0"/>
+            </w:pPr>
+            <w:r>
+              <w:rPr>
+                <w:b w:val="false"/>
+                <w:bCs w:val="false"/>
+              </w:rPr>
+              <w:t xml:space="preserve">Vẽ thẻ người chơi: nền, viền sáng khi đến lượt, ký hiệu và số trận thắng</w:t>
+            </w:r>
+          </w:p>
+        </w:tc>
+      </w:tr>
+      <w:tr>
+        <w:tc>
+          <w:tcPr>
+            <w:tcW w:type="dxa" w:w="3800"/>
+            <w:tcBorders>
+              <w:top w:val="single" w:color="BFC7D1" w:sz="1"/>
+              <w:left w:val="single" w:color="BFC7D1" w:sz="1"/>
+              <w:bottom w:val="single" w:color="BFC7D1" w:sz="1"/>
+              <w:right w:val="single" w:color="BFC7D1" w:sz="1"/>
+            </w:tcBorders>
+            <w:tcMar>
+              <w:top w:type="dxa" w:w="80"/>
+              <w:left w:type="dxa" w:w="120"/>
+              <w:bottom w:type="dxa" w:w="80"/>
+              <w:right w:type="dxa" w:w="120"/>
+            </w:tcMar>
+          </w:tcPr>
+          <w:p>
+            <w:pPr>
+              <w:spacing w:after="0"/>
+            </w:pPr>
+            <w:r>
+              <w:rPr>
+                <w:b w:val="false"/>
+                <w:bCs w:val="false"/>
+              </w:rPr>
+              <w:t xml:space="preserve">TicTacToe._button(rect, label)</w:t>
+            </w:r>
+          </w:p>
+        </w:tc>
+        <w:tc>
+          <w:tcPr>
+            <w:tcW w:type="dxa" w:w="5226"/>
+            <w:tcBorders>
+              <w:top w:val="single" w:color="BFC7D1" w:sz="1"/>
+              <w:left w:val="single" w:color="BFC7D1" w:sz="1"/>
+              <w:bottom w:val="single" w:color="BFC7D1" w:sz="1"/>
+              <w:right w:val="single" w:color="BFC7D1" w:sz="1"/>
+            </w:tcBorders>
+            <w:tcMar>
+              <w:top w:type="dxa" w:w="80"/>
+              <w:left w:type="dxa" w:w="120"/>
+              <w:bottom w:type="dxa" w:w="80"/>
+              <w:right w:type="dxa" w:w="120"/>
+            </w:tcMar>
+          </w:tcPr>
+          <w:p>
+            <w:pPr>
+              <w:spacing w:after="0"/>
+            </w:pPr>
+            <w:r>
+              <w:rPr>
+                <w:b w:val="false"/>
+                <w:bCs w:val="false"/>
+              </w:rPr>
+              <w:t xml:space="preserve">Vẽ nút bấm, đổi màu khi rê chuột vào</w:t>
+            </w:r>
+          </w:p>
+        </w:tc>
+      </w:tr>
+      <w:tr>
+        <w:tc>
+          <w:tcPr>
+            <w:tcW w:type="dxa" w:w="3800"/>
+            <w:tcBorders>
+              <w:top w:val="single" w:color="BFC7D1" w:sz="1"/>
+              <w:left w:val="single" w:color="BFC7D1" w:sz="1"/>
+              <w:bottom w:val="single" w:color="BFC7D1" w:sz="1"/>
+              <w:right w:val="single" w:color="BFC7D1" w:sz="1"/>
+            </w:tcBorders>
+            <w:tcMar>
+              <w:top w:type="dxa" w:w="80"/>
+              <w:left w:type="dxa" w:w="120"/>
+              <w:bottom w:type="dxa" w:w="80"/>
+              <w:right w:type="dxa" w:w="120"/>
+            </w:tcMar>
+          </w:tcPr>
+          <w:p>
+            <w:pPr>
+              <w:spacing w:after="0"/>
+            </w:pPr>
+            <w:r>
+              <w:rPr>
+                <w:b w:val="false"/>
+                <w:bCs w:val="false"/>
+              </w:rPr>
               <w:t xml:space="preserve">TicTacToe.draw()</w:t>
             </w:r>
           </w:p>
@@ -2352,7 +2480,7 @@
                 <w:b w:val="false"/>
                 <w:bCs w:val="false"/>
               </w:rPr>
-              <w:t xml:space="preserve">Xoá nền, vẽ vùng rê chuột, lưới, quân, vạch thắng, dòng trạng thái và gợi ý phím tắt</w:t>
+              <w:t xml:space="preserve">Xoá nền, vẽ hai thẻ người chơi, vùng rê chuột, lưới, quân, vạch thắng, dòng trạng thái và hai nút</w:t>
             </w:r>
           </w:p>
         </w:tc>
@@ -3046,6 +3174,362 @@
                 <w:b w:val="false"/>
                 <w:bCs w:val="false"/>
               </w:rPr>
+              <w:t xml:space="preserve">hover_button</w:t>
+            </w:r>
+          </w:p>
+        </w:tc>
+        <w:tc>
+          <w:tcPr>
+            <w:tcW w:type="dxa" w:w="2500"/>
+            <w:tcBorders>
+              <w:top w:val="single" w:color="BFC7D1" w:sz="1"/>
+              <w:left w:val="single" w:color="BFC7D1" w:sz="1"/>
+              <w:bottom w:val="single" w:color="BFC7D1" w:sz="1"/>
+              <w:right w:val="single" w:color="BFC7D1" w:sz="1"/>
+            </w:tcBorders>
+            <w:tcMar>
+              <w:top w:type="dxa" w:w="80"/>
+              <w:left w:type="dxa" w:w="120"/>
+              <w:bottom w:type="dxa" w:w="80"/>
+              <w:right w:type="dxa" w:w="120"/>
+            </w:tcMar>
+          </w:tcPr>
+          <w:p>
+            <w:pPr>
+              <w:spacing w:after="0"/>
+            </w:pPr>
+            <w:r>
+              <w:rPr>
+                <w:b w:val="false"/>
+                <w:bCs w:val="false"/>
+              </w:rPr>
+              <w:t xml:space="preserve">pygame.Rect | None</w:t>
+            </w:r>
+          </w:p>
+        </w:tc>
+        <w:tc>
+          <w:tcPr>
+            <w:tcW w:type="dxa" w:w="4526"/>
+            <w:tcBorders>
+              <w:top w:val="single" w:color="BFC7D1" w:sz="1"/>
+              <w:left w:val="single" w:color="BFC7D1" w:sz="1"/>
+              <w:bottom w:val="single" w:color="BFC7D1" w:sz="1"/>
+              <w:right w:val="single" w:color="BFC7D1" w:sz="1"/>
+            </w:tcBorders>
+            <w:tcMar>
+              <w:top w:type="dxa" w:w="80"/>
+              <w:left w:type="dxa" w:w="120"/>
+              <w:bottom w:type="dxa" w:w="80"/>
+              <w:right w:type="dxa" w:w="120"/>
+            </w:tcMar>
+          </w:tcPr>
+          <w:p>
+            <w:pPr>
+              <w:spacing w:after="0"/>
+            </w:pPr>
+            <w:r>
+              <w:rPr>
+                <w:b w:val="false"/>
+                <w:bCs w:val="false"/>
+              </w:rPr>
+              <w:t xml:space="preserve">Nút đang rê chuột, dùng để đổi màu</w:t>
+            </w:r>
+          </w:p>
+        </w:tc>
+      </w:tr>
+      <w:tr>
+        <w:tc>
+          <w:tcPr>
+            <w:tcW w:type="dxa" w:w="2000"/>
+            <w:tcBorders>
+              <w:top w:val="single" w:color="BFC7D1" w:sz="1"/>
+              <w:left w:val="single" w:color="BFC7D1" w:sz="1"/>
+              <w:bottom w:val="single" w:color="BFC7D1" w:sz="1"/>
+              <w:right w:val="single" w:color="BFC7D1" w:sz="1"/>
+            </w:tcBorders>
+            <w:tcMar>
+              <w:top w:type="dxa" w:w="80"/>
+              <w:left w:type="dxa" w:w="120"/>
+              <w:bottom w:type="dxa" w:w="80"/>
+              <w:right w:type="dxa" w:w="120"/>
+            </w:tcMar>
+          </w:tcPr>
+          <w:p>
+            <w:pPr>
+              <w:spacing w:after="0"/>
+            </w:pPr>
+            <w:r>
+              <w:rPr>
+                <w:b w:val="false"/>
+                <w:bCs w:val="false"/>
+              </w:rPr>
+              <w:t xml:space="preserve">wins</w:t>
+            </w:r>
+          </w:p>
+        </w:tc>
+        <w:tc>
+          <w:tcPr>
+            <w:tcW w:type="dxa" w:w="2500"/>
+            <w:tcBorders>
+              <w:top w:val="single" w:color="BFC7D1" w:sz="1"/>
+              <w:left w:val="single" w:color="BFC7D1" w:sz="1"/>
+              <w:bottom w:val="single" w:color="BFC7D1" w:sz="1"/>
+              <w:right w:val="single" w:color="BFC7D1" w:sz="1"/>
+            </w:tcBorders>
+            <w:tcMar>
+              <w:top w:type="dxa" w:w="80"/>
+              <w:left w:type="dxa" w:w="120"/>
+              <w:bottom w:type="dxa" w:w="80"/>
+              <w:right w:type="dxa" w:w="120"/>
+            </w:tcMar>
+          </w:tcPr>
+          <w:p>
+            <w:pPr>
+              <w:spacing w:after="0"/>
+            </w:pPr>
+            <w:r>
+              <w:rPr>
+                <w:b w:val="false"/>
+                <w:bCs w:val="false"/>
+              </w:rPr>
+              <w:t xml:space="preserve">dict[str, int]</w:t>
+            </w:r>
+          </w:p>
+        </w:tc>
+        <w:tc>
+          <w:tcPr>
+            <w:tcW w:type="dxa" w:w="4526"/>
+            <w:tcBorders>
+              <w:top w:val="single" w:color="BFC7D1" w:sz="1"/>
+              <w:left w:val="single" w:color="BFC7D1" w:sz="1"/>
+              <w:bottom w:val="single" w:color="BFC7D1" w:sz="1"/>
+              <w:right w:val="single" w:color="BFC7D1" w:sz="1"/>
+            </w:tcBorders>
+            <w:tcMar>
+              <w:top w:type="dxa" w:w="80"/>
+              <w:left w:type="dxa" w:w="120"/>
+              <w:bottom w:type="dxa" w:w="80"/>
+              <w:right w:type="dxa" w:w="120"/>
+            </w:tcMar>
+          </w:tcPr>
+          <w:p>
+            <w:pPr>
+              <w:spacing w:after="0"/>
+            </w:pPr>
+            <w:r>
+              <w:rPr>
+                <w:b w:val="false"/>
+                <w:bCs w:val="false"/>
+              </w:rPr>
+              <w:t xml:space="preserve">Số trận thắng của từng người, giữ xuyên suốt các ván</w:t>
+            </w:r>
+          </w:p>
+        </w:tc>
+      </w:tr>
+      <w:tr>
+        <w:tc>
+          <w:tcPr>
+            <w:tcW w:type="dxa" w:w="2000"/>
+            <w:tcBorders>
+              <w:top w:val="single" w:color="BFC7D1" w:sz="1"/>
+              <w:left w:val="single" w:color="BFC7D1" w:sz="1"/>
+              <w:bottom w:val="single" w:color="BFC7D1" w:sz="1"/>
+              <w:right w:val="single" w:color="BFC7D1" w:sz="1"/>
+            </w:tcBorders>
+            <w:tcMar>
+              <w:top w:type="dxa" w:w="80"/>
+              <w:left w:type="dxa" w:w="120"/>
+              <w:bottom w:type="dxa" w:w="80"/>
+              <w:right w:type="dxa" w:w="120"/>
+            </w:tcMar>
+          </w:tcPr>
+          <w:p>
+            <w:pPr>
+              <w:spacing w:after="0"/>
+            </w:pPr>
+            <w:r>
+              <w:rPr>
+                <w:b w:val="false"/>
+                <w:bCs w:val="false"/>
+              </w:rPr>
+              <w:t xml:space="preserve">draws</w:t>
+            </w:r>
+          </w:p>
+        </w:tc>
+        <w:tc>
+          <w:tcPr>
+            <w:tcW w:type="dxa" w:w="2500"/>
+            <w:tcBorders>
+              <w:top w:val="single" w:color="BFC7D1" w:sz="1"/>
+              <w:left w:val="single" w:color="BFC7D1" w:sz="1"/>
+              <w:bottom w:val="single" w:color="BFC7D1" w:sz="1"/>
+              <w:right w:val="single" w:color="BFC7D1" w:sz="1"/>
+            </w:tcBorders>
+            <w:tcMar>
+              <w:top w:type="dxa" w:w="80"/>
+              <w:left w:type="dxa" w:w="120"/>
+              <w:bottom w:type="dxa" w:w="80"/>
+              <w:right w:type="dxa" w:w="120"/>
+            </w:tcMar>
+          </w:tcPr>
+          <w:p>
+            <w:pPr>
+              <w:spacing w:after="0"/>
+            </w:pPr>
+            <w:r>
+              <w:rPr>
+                <w:b w:val="false"/>
+                <w:bCs w:val="false"/>
+              </w:rPr>
+              <w:t xml:space="preserve">int</w:t>
+            </w:r>
+          </w:p>
+        </w:tc>
+        <w:tc>
+          <w:tcPr>
+            <w:tcW w:type="dxa" w:w="4526"/>
+            <w:tcBorders>
+              <w:top w:val="single" w:color="BFC7D1" w:sz="1"/>
+              <w:left w:val="single" w:color="BFC7D1" w:sz="1"/>
+              <w:bottom w:val="single" w:color="BFC7D1" w:sz="1"/>
+              <w:right w:val="single" w:color="BFC7D1" w:sz="1"/>
+            </w:tcBorders>
+            <w:tcMar>
+              <w:top w:type="dxa" w:w="80"/>
+              <w:left w:type="dxa" w:w="120"/>
+              <w:bottom w:type="dxa" w:w="80"/>
+              <w:right w:type="dxa" w:w="120"/>
+            </w:tcMar>
+          </w:tcPr>
+          <w:p>
+            <w:pPr>
+              <w:spacing w:after="0"/>
+            </w:pPr>
+            <w:r>
+              <w:rPr>
+                <w:b w:val="false"/>
+                <w:bCs w:val="false"/>
+              </w:rPr>
+              <w:t xml:space="preserve">Số ván hoà</w:t>
+            </w:r>
+          </w:p>
+        </w:tc>
+      </w:tr>
+      <w:tr>
+        <w:tc>
+          <w:tcPr>
+            <w:tcW w:type="dxa" w:w="2000"/>
+            <w:tcBorders>
+              <w:top w:val="single" w:color="BFC7D1" w:sz="1"/>
+              <w:left w:val="single" w:color="BFC7D1" w:sz="1"/>
+              <w:bottom w:val="single" w:color="BFC7D1" w:sz="1"/>
+              <w:right w:val="single" w:color="BFC7D1" w:sz="1"/>
+            </w:tcBorders>
+            <w:tcMar>
+              <w:top w:type="dxa" w:w="80"/>
+              <w:left w:type="dxa" w:w="120"/>
+              <w:bottom w:type="dxa" w:w="80"/>
+              <w:right w:type="dxa" w:w="120"/>
+            </w:tcMar>
+          </w:tcPr>
+          <w:p>
+            <w:pPr>
+              <w:spacing w:after="0"/>
+            </w:pPr>
+            <w:r>
+              <w:rPr>
+                <w:b w:val="false"/>
+                <w:bCs w:val="false"/>
+              </w:rPr>
+              <w:t xml:space="preserve">btn_play / btn_clear</w:t>
+            </w:r>
+          </w:p>
+        </w:tc>
+        <w:tc>
+          <w:tcPr>
+            <w:tcW w:type="dxa" w:w="2500"/>
+            <w:tcBorders>
+              <w:top w:val="single" w:color="BFC7D1" w:sz="1"/>
+              <w:left w:val="single" w:color="BFC7D1" w:sz="1"/>
+              <w:bottom w:val="single" w:color="BFC7D1" w:sz="1"/>
+              <w:right w:val="single" w:color="BFC7D1" w:sz="1"/>
+            </w:tcBorders>
+            <w:tcMar>
+              <w:top w:type="dxa" w:w="80"/>
+              <w:left w:type="dxa" w:w="120"/>
+              <w:bottom w:type="dxa" w:w="80"/>
+              <w:right w:type="dxa" w:w="120"/>
+            </w:tcMar>
+          </w:tcPr>
+          <w:p>
+            <w:pPr>
+              <w:spacing w:after="0"/>
+            </w:pPr>
+            <w:r>
+              <w:rPr>
+                <w:b w:val="false"/>
+                <w:bCs w:val="false"/>
+              </w:rPr>
+              <w:t xml:space="preserve">pygame.Rect</w:t>
+            </w:r>
+          </w:p>
+        </w:tc>
+        <w:tc>
+          <w:tcPr>
+            <w:tcW w:type="dxa" w:w="4526"/>
+            <w:tcBorders>
+              <w:top w:val="single" w:color="BFC7D1" w:sz="1"/>
+              <w:left w:val="single" w:color="BFC7D1" w:sz="1"/>
+              <w:bottom w:val="single" w:color="BFC7D1" w:sz="1"/>
+              <w:right w:val="single" w:color="BFC7D1" w:sz="1"/>
+            </w:tcBorders>
+            <w:tcMar>
+              <w:top w:type="dxa" w:w="80"/>
+              <w:left w:type="dxa" w:w="120"/>
+              <w:bottom w:type="dxa" w:w="80"/>
+              <w:right w:type="dxa" w:w="120"/>
+            </w:tcMar>
+          </w:tcPr>
+          <w:p>
+            <w:pPr>
+              <w:spacing w:after="0"/>
+            </w:pPr>
+            <w:r>
+              <w:rPr>
+                <w:b w:val="false"/>
+                <w:bCs w:val="false"/>
+              </w:rPr>
+              <w:t xml:space="preserve">Vùng bấm của nút Chơi lại và Xóa điểm</w:t>
+            </w:r>
+          </w:p>
+        </w:tc>
+      </w:tr>
+      <w:tr>
+        <w:tc>
+          <w:tcPr>
+            <w:tcW w:type="dxa" w:w="2000"/>
+            <w:tcBorders>
+              <w:top w:val="single" w:color="BFC7D1" w:sz="1"/>
+              <w:left w:val="single" w:color="BFC7D1" w:sz="1"/>
+              <w:bottom w:val="single" w:color="BFC7D1" w:sz="1"/>
+              <w:right w:val="single" w:color="BFC7D1" w:sz="1"/>
+            </w:tcBorders>
+            <w:tcMar>
+              <w:top w:type="dxa" w:w="80"/>
+              <w:left w:type="dxa" w:w="120"/>
+              <w:bottom w:type="dxa" w:w="80"/>
+              <w:right w:type="dxa" w:w="120"/>
+            </w:tcMar>
+          </w:tcPr>
+          <w:p>
+            <w:pPr>
+              <w:spacing w:after="0"/>
+            </w:pPr>
+            <w:r>
+              <w:rPr>
+                <w:b w:val="false"/>
+                <w:bCs w:val="false"/>
+              </w:rPr>
               <w:t xml:space="preserve">moves</w:t>
             </w:r>
           </w:p>
@@ -3104,7 +3588,7 @@
                 <w:b w:val="false"/>
                 <w:bCs w:val="false"/>
               </w:rPr>
-              <w:t xml:space="preserve">Số nước đã đi</w:t>
+              <w:t xml:space="preserve">Số nước đã đi trong ván hiện tại</w:t>
             </w:r>
           </w:p>
         </w:tc>
@@ -3115,7 +3599,7 @@
         <w:spacing w:after="120"/>
       </w:pPr>
       <w:r>
-        <w:t xml:space="preserve">Ba phương thức chính: reset() khởi tạo lại toàn bộ trạng thái, handle_event() xử lý sự kiện chuột và bàn phím, play() đặt quân và kiểm tra kết quả. Hàm main() chỉ lo phần tạo cửa sổ và vòng lặp sự kiện, nhờ vậy phần logic hoàn toàn tách biệt khỏi phần hiển thị.</w:t>
+        <w:t xml:space="preserve">Năm phương thức chính: reset() khởi tạo lại ván đang chơi nhưng giữ nguyên điểm, reset_scores() xoá cả bảng điểm, handle_event() xử lý sự kiện chuột và bàn phím, _button_at() xác định nút nào vừa được bấm, play() đặt quân, kiểm tra kết quả và cộng điểm. Hàm main() chỉ lo phần tạo cửa sổ và vòng lặp sự kiện, nhờ vậy phần logic hoàn toàn tách biệt khỏi phần hiển thị.</w:t>
       </w:r>
     </w:p>
     <w:p>
@@ -3123,7 +3607,15 @@
         <w:pStyle w:val="Heading2"/>
       </w:pPr>
       <w:r>
-        <w:t xml:space="preserve">3.5. Phím tắt</w:t>
+        <w:t xml:space="preserve">3.5. Bảng điểm và thao tác</w:t>
+      </w:r>
+    </w:p>
+    <w:p>
+      <w:pPr>
+        <w:spacing w:after="120"/>
+      </w:pPr>
+      <w:r>
+        <w:t xml:space="preserve">Mỗi người có một thẻ riêng ở đầu màn hình. Thẻ của người đang đến lượt được viền sáng màu của họ còn thẻ kia mờ đi, nhờ vậy nhìn nhanh biết lượt đi thuộc về ai. Mỗi lần có người thắng, số thắng của họ tăng thêm 1; số ván hoà cũng được cộng vào giữa hai thẻ. Nút Chơi lại chỉ xoá ván đang chơi và giữ nguyên điểm, còn nút Xóa điểm mới đưa cả bảng điểm về 0.</w:t>
       </w:r>
     </w:p>
     <w:tbl>
@@ -3139,8 +3631,8 @@
         </w:tblBorders>
       </w:tblPr>
       <w:tblGrid>
-        <w:gridCol w:w="3000"/>
-        <w:gridCol w:w="6026"/>
+        <w:gridCol w:w="3200"/>
+        <w:gridCol w:w="5826"/>
       </w:tblGrid>
       <w:tr>
         <w:trPr>
@@ -3148,7 +3640,7 @@
         </w:trPr>
         <w:tc>
           <w:tcPr>
-            <w:tcW w:type="dxa" w:w="3000"/>
+            <w:tcW w:type="dxa" w:w="3200"/>
             <w:tcBorders>
               <w:top w:val="single" w:color="BFC7D1" w:sz="1"/>
               <w:left w:val="single" w:color="BFC7D1" w:sz="1"/>
@@ -3172,13 +3664,13 @@
                 <w:b/>
                 <w:bCs/>
               </w:rPr>
-              <w:t xml:space="preserve">Phím</w:t>
-            </w:r>
-          </w:p>
-        </w:tc>
-        <w:tc>
-          <w:tcPr>
-            <w:tcW w:type="dxa" w:w="6026"/>
+              <w:t xml:space="preserve">Thao tác</w:t>
+            </w:r>
+          </w:p>
+        </w:tc>
+        <w:tc>
+          <w:tcPr>
+            <w:tcW w:type="dxa" w:w="5826"/>
             <w:tcBorders>
               <w:top w:val="single" w:color="BFC7D1" w:sz="1"/>
               <w:left w:val="single" w:color="BFC7D1" w:sz="1"/>
@@ -3210,59 +3702,59 @@
       <w:tr>
         <w:tc>
           <w:tcPr>
-            <w:tcW w:type="dxa" w:w="3000"/>
-            <w:tcBorders>
-              <w:top w:val="single" w:color="BFC7D1" w:sz="1"/>
-              <w:left w:val="single" w:color="BFC7D1" w:sz="1"/>
-              <w:bottom w:val="single" w:color="BFC7D1" w:sz="1"/>
-              <w:right w:val="single" w:color="BFC7D1" w:sz="1"/>
-            </w:tcBorders>
-            <w:tcMar>
-              <w:top w:type="dxa" w:w="80"/>
-              <w:left w:type="dxa" w:w="120"/>
-              <w:bottom w:type="dxa" w:w="80"/>
-              <w:right w:type="dxa" w:w="120"/>
-            </w:tcMar>
-          </w:tcPr>
-          <w:p>
-            <w:pPr>
-              <w:spacing w:after="0"/>
-            </w:pPr>
-            <w:r>
-              <w:rPr>
-                <w:b w:val="false"/>
-                <w:bCs w:val="false"/>
-              </w:rPr>
-              <w:t xml:space="preserve">Chuột trái</w:t>
-            </w:r>
-          </w:p>
-        </w:tc>
-        <w:tc>
-          <w:tcPr>
-            <w:tcW w:type="dxa" w:w="6026"/>
-            <w:tcBorders>
-              <w:top w:val="single" w:color="BFC7D1" w:sz="1"/>
-              <w:left w:val="single" w:color="BFC7D1" w:sz="1"/>
-              <w:bottom w:val="single" w:color="BFC7D1" w:sz="1"/>
-              <w:right w:val="single" w:color="BFC7D1" w:sz="1"/>
-            </w:tcBorders>
-            <w:tcMar>
-              <w:top w:type="dxa" w:w="80"/>
-              <w:left w:type="dxa" w:w="120"/>
-              <w:bottom w:type="dxa" w:w="80"/>
-              <w:right w:type="dxa" w:w="120"/>
-            </w:tcMar>
-          </w:tcPr>
-          <w:p>
-            <w:pPr>
-              <w:spacing w:after="0"/>
-            </w:pPr>
-            <w:r>
-              <w:rPr>
-                <w:b w:val="false"/>
-                <w:bCs w:val="false"/>
-              </w:rPr>
-              <w:t xml:space="preserve">Đặt quân X hoặc O vào ô được chọn</w:t>
+            <w:tcW w:type="dxa" w:w="3200"/>
+            <w:tcBorders>
+              <w:top w:val="single" w:color="BFC7D1" w:sz="1"/>
+              <w:left w:val="single" w:color="BFC7D1" w:sz="1"/>
+              <w:bottom w:val="single" w:color="BFC7D1" w:sz="1"/>
+              <w:right w:val="single" w:color="BFC7D1" w:sz="1"/>
+            </w:tcBorders>
+            <w:tcMar>
+              <w:top w:type="dxa" w:w="80"/>
+              <w:left w:type="dxa" w:w="120"/>
+              <w:bottom w:type="dxa" w:w="80"/>
+              <w:right w:type="dxa" w:w="120"/>
+            </w:tcMar>
+          </w:tcPr>
+          <w:p>
+            <w:pPr>
+              <w:spacing w:after="0"/>
+            </w:pPr>
+            <w:r>
+              <w:rPr>
+                <w:b w:val="false"/>
+                <w:bCs w:val="false"/>
+              </w:rPr>
+              <w:t xml:space="preserve">Chuột trái trên ô bàn cờ</w:t>
+            </w:r>
+          </w:p>
+        </w:tc>
+        <w:tc>
+          <w:tcPr>
+            <w:tcW w:type="dxa" w:w="5826"/>
+            <w:tcBorders>
+              <w:top w:val="single" w:color="BFC7D1" w:sz="1"/>
+              <w:left w:val="single" w:color="BFC7D1" w:sz="1"/>
+              <w:bottom w:val="single" w:color="BFC7D1" w:sz="1"/>
+              <w:right w:val="single" w:color="BFC7D1" w:sz="1"/>
+            </w:tcBorders>
+            <w:tcMar>
+              <w:top w:type="dxa" w:w="80"/>
+              <w:left w:type="dxa" w:w="120"/>
+              <w:bottom w:type="dxa" w:w="80"/>
+              <w:right w:type="dxa" w:w="120"/>
+            </w:tcMar>
+          </w:tcPr>
+          <w:p>
+            <w:pPr>
+              <w:spacing w:after="0"/>
+            </w:pPr>
+            <w:r>
+              <w:rPr>
+                <w:b w:val="false"/>
+                <w:bCs w:val="false"/>
+              </w:rPr>
+              <w:t xml:space="preserve">Đặt quân X hoặc O vào ô đang trống</w:t>
             </w:r>
           </w:p>
         </w:tc>
@@ -3270,59 +3762,59 @@
       <w:tr>
         <w:tc>
           <w:tcPr>
-            <w:tcW w:type="dxa" w:w="3000"/>
-            <w:tcBorders>
-              <w:top w:val="single" w:color="BFC7D1" w:sz="1"/>
-              <w:left w:val="single" w:color="BFC7D1" w:sz="1"/>
-              <w:bottom w:val="single" w:color="BFC7D1" w:sz="1"/>
-              <w:right w:val="single" w:color="BFC7D1" w:sz="1"/>
-            </w:tcBorders>
-            <w:tcMar>
-              <w:top w:type="dxa" w:w="80"/>
-              <w:left w:type="dxa" w:w="120"/>
-              <w:bottom w:type="dxa" w:w="80"/>
-              <w:right w:type="dxa" w:w="120"/>
-            </w:tcMar>
-          </w:tcPr>
-          <w:p>
-            <w:pPr>
-              <w:spacing w:after="0"/>
-            </w:pPr>
-            <w:r>
-              <w:rPr>
-                <w:b w:val="false"/>
-                <w:bCs w:val="false"/>
-              </w:rPr>
-              <w:t xml:space="preserve">R</w:t>
-            </w:r>
-          </w:p>
-        </w:tc>
-        <w:tc>
-          <w:tcPr>
-            <w:tcW w:type="dxa" w:w="6026"/>
-            <w:tcBorders>
-              <w:top w:val="single" w:color="BFC7D1" w:sz="1"/>
-              <w:left w:val="single" w:color="BFC7D1" w:sz="1"/>
-              <w:bottom w:val="single" w:color="BFC7D1" w:sz="1"/>
-              <w:right w:val="single" w:color="BFC7D1" w:sz="1"/>
-            </w:tcBorders>
-            <w:tcMar>
-              <w:top w:type="dxa" w:w="80"/>
-              <w:left w:type="dxa" w:w="120"/>
-              <w:bottom w:type="dxa" w:w="80"/>
-              <w:right w:type="dxa" w:w="120"/>
-            </w:tcMar>
-          </w:tcPr>
-          <w:p>
-            <w:pPr>
-              <w:spacing w:after="0"/>
-            </w:pPr>
-            <w:r>
-              <w:rPr>
-                <w:b w:val="false"/>
-                <w:bCs w:val="false"/>
-              </w:rPr>
-              <w:t xml:space="preserve">Chơi lại từ đầu</w:t>
+            <w:tcW w:type="dxa" w:w="3200"/>
+            <w:tcBorders>
+              <w:top w:val="single" w:color="BFC7D1" w:sz="1"/>
+              <w:left w:val="single" w:color="BFC7D1" w:sz="1"/>
+              <w:bottom w:val="single" w:color="BFC7D1" w:sz="1"/>
+              <w:right w:val="single" w:color="BFC7D1" w:sz="1"/>
+            </w:tcBorders>
+            <w:tcMar>
+              <w:top w:type="dxa" w:w="80"/>
+              <w:left w:type="dxa" w:w="120"/>
+              <w:bottom w:type="dxa" w:w="80"/>
+              <w:right w:type="dxa" w:w="120"/>
+            </w:tcMar>
+          </w:tcPr>
+          <w:p>
+            <w:pPr>
+              <w:spacing w:after="0"/>
+            </w:pPr>
+            <w:r>
+              <w:rPr>
+                <w:b w:val="false"/>
+                <w:bCs w:val="false"/>
+              </w:rPr>
+              <w:t xml:space="preserve">Chuột trái trên nút Chơi lại</w:t>
+            </w:r>
+          </w:p>
+        </w:tc>
+        <w:tc>
+          <w:tcPr>
+            <w:tcW w:type="dxa" w:w="5826"/>
+            <w:tcBorders>
+              <w:top w:val="single" w:color="BFC7D1" w:sz="1"/>
+              <w:left w:val="single" w:color="BFC7D1" w:sz="1"/>
+              <w:bottom w:val="single" w:color="BFC7D1" w:sz="1"/>
+              <w:right w:val="single" w:color="BFC7D1" w:sz="1"/>
+            </w:tcBorders>
+            <w:tcMar>
+              <w:top w:type="dxa" w:w="80"/>
+              <w:left w:type="dxa" w:w="120"/>
+              <w:bottom w:type="dxa" w:w="80"/>
+              <w:right w:type="dxa" w:w="120"/>
+            </w:tcMar>
+          </w:tcPr>
+          <w:p>
+            <w:pPr>
+              <w:spacing w:after="0"/>
+            </w:pPr>
+            <w:r>
+              <w:rPr>
+                <w:b w:val="false"/>
+                <w:bCs w:val="false"/>
+              </w:rPr>
+              <w:t xml:space="preserve">Bắt đầu ván mới, giữ nguyên bảng điểm</w:t>
             </w:r>
           </w:p>
         </w:tc>
@@ -3330,36 +3822,156 @@
       <w:tr>
         <w:tc>
           <w:tcPr>
-            <w:tcW w:type="dxa" w:w="3000"/>
-            <w:tcBorders>
-              <w:top w:val="single" w:color="BFC7D1" w:sz="1"/>
-              <w:left w:val="single" w:color="BFC7D1" w:sz="1"/>
-              <w:bottom w:val="single" w:color="BFC7D1" w:sz="1"/>
-              <w:right w:val="single" w:color="BFC7D1" w:sz="1"/>
-            </w:tcBorders>
-            <w:tcMar>
-              <w:top w:type="dxa" w:w="80"/>
-              <w:left w:type="dxa" w:w="120"/>
-              <w:bottom w:type="dxa" w:w="80"/>
-              <w:right w:type="dxa" w:w="120"/>
-            </w:tcMar>
-          </w:tcPr>
-          <w:p>
-            <w:pPr>
-              <w:spacing w:after="0"/>
-            </w:pPr>
-            <w:r>
-              <w:rPr>
-                <w:b w:val="false"/>
-                <w:bCs w:val="false"/>
-              </w:rPr>
-              <w:t xml:space="preserve">ESC hoặc Q</w:t>
-            </w:r>
-          </w:p>
-        </w:tc>
-        <w:tc>
-          <w:tcPr>
-            <w:tcW w:type="dxa" w:w="6026"/>
+            <w:tcW w:type="dxa" w:w="3200"/>
+            <w:tcBorders>
+              <w:top w:val="single" w:color="BFC7D1" w:sz="1"/>
+              <w:left w:val="single" w:color="BFC7D1" w:sz="1"/>
+              <w:bottom w:val="single" w:color="BFC7D1" w:sz="1"/>
+              <w:right w:val="single" w:color="BFC7D1" w:sz="1"/>
+            </w:tcBorders>
+            <w:tcMar>
+              <w:top w:type="dxa" w:w="80"/>
+              <w:left w:type="dxa" w:w="120"/>
+              <w:bottom w:type="dxa" w:w="80"/>
+              <w:right w:type="dxa" w:w="120"/>
+            </w:tcMar>
+          </w:tcPr>
+          <w:p>
+            <w:pPr>
+              <w:spacing w:after="0"/>
+            </w:pPr>
+            <w:r>
+              <w:rPr>
+                <w:b w:val="false"/>
+                <w:bCs w:val="false"/>
+              </w:rPr>
+              <w:t xml:space="preserve">Chuột trái trên nút Xóa điểm</w:t>
+            </w:r>
+          </w:p>
+        </w:tc>
+        <w:tc>
+          <w:tcPr>
+            <w:tcW w:type="dxa" w:w="5826"/>
+            <w:tcBorders>
+              <w:top w:val="single" w:color="BFC7D1" w:sz="1"/>
+              <w:left w:val="single" w:color="BFC7D1" w:sz="1"/>
+              <w:bottom w:val="single" w:color="BFC7D1" w:sz="1"/>
+              <w:right w:val="single" w:color="BFC7D1" w:sz="1"/>
+            </w:tcBorders>
+            <w:tcMar>
+              <w:top w:type="dxa" w:w="80"/>
+              <w:left w:type="dxa" w:w="120"/>
+              <w:bottom w:type="dxa" w:w="80"/>
+              <w:right w:type="dxa" w:w="120"/>
+            </w:tcMar>
+          </w:tcPr>
+          <w:p>
+            <w:pPr>
+              <w:spacing w:after="0"/>
+            </w:pPr>
+            <w:r>
+              <w:rPr>
+                <w:b w:val="false"/>
+                <w:bCs w:val="false"/>
+              </w:rPr>
+              <w:t xml:space="preserve">Xoá ván đang chơi và đưa bảng điểm về 0</w:t>
+            </w:r>
+          </w:p>
+        </w:tc>
+      </w:tr>
+      <w:tr>
+        <w:tc>
+          <w:tcPr>
+            <w:tcW w:type="dxa" w:w="3200"/>
+            <w:tcBorders>
+              <w:top w:val="single" w:color="BFC7D1" w:sz="1"/>
+              <w:left w:val="single" w:color="BFC7D1" w:sz="1"/>
+              <w:bottom w:val="single" w:color="BFC7D1" w:sz="1"/>
+              <w:right w:val="single" w:color="BFC7D1" w:sz="1"/>
+            </w:tcBorders>
+            <w:tcMar>
+              <w:top w:type="dxa" w:w="80"/>
+              <w:left w:type="dxa" w:w="120"/>
+              <w:bottom w:type="dxa" w:w="80"/>
+              <w:right w:type="dxa" w:w="120"/>
+            </w:tcMar>
+          </w:tcPr>
+          <w:p>
+            <w:pPr>
+              <w:spacing w:after="0"/>
+            </w:pPr>
+            <w:r>
+              <w:rPr>
+                <w:b w:val="false"/>
+                <w:bCs w:val="false"/>
+              </w:rPr>
+              <w:t xml:space="preserve">Phím R</w:t>
+            </w:r>
+          </w:p>
+        </w:tc>
+        <w:tc>
+          <w:tcPr>
+            <w:tcW w:type="dxa" w:w="5826"/>
+            <w:tcBorders>
+              <w:top w:val="single" w:color="BFC7D1" w:sz="1"/>
+              <w:left w:val="single" w:color="BFC7D1" w:sz="1"/>
+              <w:bottom w:val="single" w:color="BFC7D1" w:sz="1"/>
+              <w:right w:val="single" w:color="BFC7D1" w:sz="1"/>
+            </w:tcBorders>
+            <w:tcMar>
+              <w:top w:type="dxa" w:w="80"/>
+              <w:left w:type="dxa" w:w="120"/>
+              <w:bottom w:type="dxa" w:w="80"/>
+              <w:right w:type="dxa" w:w="120"/>
+            </w:tcMar>
+          </w:tcPr>
+          <w:p>
+            <w:pPr>
+              <w:spacing w:after="0"/>
+            </w:pPr>
+            <w:r>
+              <w:rPr>
+                <w:b w:val="false"/>
+                <w:bCs w:val="false"/>
+              </w:rPr>
+              <w:t xml:space="preserve">Chơi lại từ đầu (tương đương nút Chơi lại)</w:t>
+            </w:r>
+          </w:p>
+        </w:tc>
+      </w:tr>
+      <w:tr>
+        <w:tc>
+          <w:tcPr>
+            <w:tcW w:type="dxa" w:w="3200"/>
+            <w:tcBorders>
+              <w:top w:val="single" w:color="BFC7D1" w:sz="1"/>
+              <w:left w:val="single" w:color="BFC7D1" w:sz="1"/>
+              <w:bottom w:val="single" w:color="BFC7D1" w:sz="1"/>
+              <w:right w:val="single" w:color="BFC7D1" w:sz="1"/>
+            </w:tcBorders>
+            <w:tcMar>
+              <w:top w:type="dxa" w:w="80"/>
+              <w:left w:type="dxa" w:w="120"/>
+              <w:bottom w:type="dxa" w:w="80"/>
+              <w:right w:type="dxa" w:w="120"/>
+            </w:tcMar>
+          </w:tcPr>
+          <w:p>
+            <w:pPr>
+              <w:spacing w:after="0"/>
+            </w:pPr>
+            <w:r>
+              <w:rPr>
+                <w:b w:val="false"/>
+                <w:bCs w:val="false"/>
+              </w:rPr>
+              <w:t xml:space="preserve">Phím ESC hoặc Q</w:t>
+            </w:r>
+          </w:p>
+        </w:tc>
+        <w:tc>
+          <w:tcPr>
+            <w:tcW w:type="dxa" w:w="5826"/>
             <w:tcBorders>
               <w:top w:val="single" w:color="BFC7D1" w:sz="1"/>
               <w:left w:val="single" w:color="BFC7D1" w:sz="1"/>
@@ -3401,7 +4013,7 @@
         <w:spacing w:after="120"/>
       </w:pPr>
       <w:r>
-        <w:t xml:space="preserve">Giao diện khi bắt đầu ván: bàn cờ trống, lượt đi của X.</w:t>
+        <w:t xml:space="preserve">Lúc bắt đầu: bàn cờ trống, thẻ Người 1 viền sáng vì X đi trước.</w:t>
       </w:r>
     </w:p>
     <w:p>
@@ -3412,9 +4024,9 @@
       <w:r>
         <w:drawing>
           <wp:inline distT="0" distB="0" distL="0" distR="0">
-            <wp:extent cx="2476500" cy="2867025"/>
+            <wp:extent cx="2381250" cy="2828925"/>
             <wp:effectExtent t="0" r="0" b="0" l="0"/>
-            <wp:docPr id="1" name="Bàn cờ 3x3 lúc bắt đầu" descr="Bàn cờ 3x3 lúc bắt đầu" title="Bàn cờ 3x3 lúc bắt đầu"/>
+            <wp:docPr id="1" name="Màn hình lúc bắt đầu" descr="Màn hình lúc bắt đầu" title="Màn hình lúc bắt đầu"/>
             <wp:cNvGraphicFramePr>
               <a:graphicFrameLocks xmlns:a="http://schemas.openxmlformats.org/drawingml/2006/main" noChangeAspect="1"/>
             </wp:cNvGraphicFramePr>
@@ -3437,7 +4049,7 @@
                   <pic:spPr bwMode="auto">
                     <a:xfrm>
                       <a:off x="0" y="0"/>
-                      <a:ext cx="2476500" cy="2867025"/>
+                      <a:ext cx="2381250" cy="2828925"/>
                     </a:xfrm>
                     <a:prstGeom prst="rect">
                       <a:avLst/>
@@ -3455,7 +4067,7 @@
         <w:spacing w:after="120"/>
       </w:pPr>
       <w:r>
-        <w:t xml:space="preserve">Giữa ván: hai người đã đi vài nước, ô đang rê chuột được tô nền để người chơi định vị trí.</w:t>
+        <w:t xml:space="preserve">Giữa ván: ô đang rê chuột được tô nền để người chơi định vị trí.</w:t>
       </w:r>
     </w:p>
     <w:p>
@@ -3466,7 +4078,7 @@
       <w:r>
         <w:drawing>
           <wp:inline distT="0" distB="0" distL="0" distR="0">
-            <wp:extent cx="2476500" cy="2867025"/>
+            <wp:extent cx="2381250" cy="2828925"/>
             <wp:effectExtent t="0" r="0" b="0" l="0"/>
             <wp:docPr id="1" name="Bàn cờ giữa ván" descr="Bàn cờ giữa ván" title="Bàn cờ giữa ván"/>
             <wp:cNvGraphicFramePr>
@@ -3491,7 +4103,7 @@
                   <pic:spPr bwMode="auto">
                     <a:xfrm>
                       <a:off x="0" y="0"/>
-                      <a:ext cx="2476500" cy="2867025"/>
+                      <a:ext cx="2381250" cy="2828925"/>
                     </a:xfrm>
                     <a:prstGeom prst="rect">
                       <a:avLst/>
@@ -3509,7 +4121,7 @@
         <w:spacing w:after="120"/>
       </w:pPr>
       <w:r>
-        <w:t xml:space="preserve">Khi X kín hàng trên cùng: dòng thông báo đổi màu xanh lá và đường thắng được tô sáng để dễ nhận biết.</w:t>
+        <w:t xml:space="preserve">Khi X kín hàng trên cùng: dòng thông báo đổi màu xanh lá và đường thắng được tô sáng.</w:t>
       </w:r>
     </w:p>
     <w:p>
@@ -3520,7 +4132,7 @@
       <w:r>
         <w:drawing>
           <wp:inline distT="0" distB="0" distL="0" distR="0">
-            <wp:extent cx="2476500" cy="2867025"/>
+            <wp:extent cx="2381250" cy="2828925"/>
             <wp:effectExtent t="0" r="0" b="0" l="0"/>
             <wp:docPr id="1" name="X thắng hàng ngang trên cùng" descr="X thắng hàng ngang trên cùng" title="X thắng hàng ngang trên cùng"/>
             <wp:cNvGraphicFramePr>
@@ -3545,7 +4157,61 @@
                   <pic:spPr bwMode="auto">
                     <a:xfrm>
                       <a:off x="0" y="0"/>
-                      <a:ext cx="2476500" cy="2867025"/>
+                      <a:ext cx="2381250" cy="2828925"/>
+                    </a:xfrm>
+                    <a:prstGeom prst="rect">
+                      <a:avLst/>
+                    </a:prstGeom>
+                  </pic:spPr>
+                </pic:pic>
+              </a:graphicData>
+            </a:graphic>
+          </wp:inline>
+        </w:drawing>
+      </w:r>
+    </w:p>
+    <w:p>
+      <w:pPr>
+        <w:spacing w:after="120"/>
+      </w:pPr>
+      <w:r>
+        <w:t xml:space="preserve">Chơi lại rồi thắng tiếp một ván nữa, cả hai thẻ đều có 1 trận thắng; nút Chơi lại sáng lên khi rê chuột vào.</w:t>
+      </w:r>
+    </w:p>
+    <w:p>
+      <w:pPr>
+        <w:spacing w:after="40" w:before="160"/>
+        <w:jc w:val="center"/>
+      </w:pPr>
+      <w:r>
+        <w:drawing>
+          <wp:inline distT="0" distB="0" distL="0" distR="0">
+            <wp:extent cx="2381250" cy="2828925"/>
+            <wp:effectExtent t="0" r="0" b="0" l="0"/>
+            <wp:docPr id="1" name="Bảng điểm hai bên và nút bấm" descr="Bảng điểm hai bên và nút bấm" title="Bảng điểm hai bên và nút bấm"/>
+            <wp:cNvGraphicFramePr>
+              <a:graphicFrameLocks xmlns:a="http://schemas.openxmlformats.org/drawingml/2006/main" noChangeAspect="1"/>
+            </wp:cNvGraphicFramePr>
+            <a:graphic xmlns:a="http://schemas.openxmlformats.org/drawingml/2006/main">
+              <a:graphicData uri="http://schemas.openxmlformats.org/drawingml/2006/picture">
+                <pic:pic xmlns:pic="http://schemas.openxmlformats.org/drawingml/2006/picture">
+                  <pic:nvPicPr>
+                    <pic:cNvPr id="0" name="" descr=""/>
+                    <pic:cNvPicPr>
+                      <a:picLocks noChangeAspect="1" noChangeArrowheads="1"/>
+                    </pic:cNvPicPr>
+                  </pic:nvPicPr>
+                  <pic:blipFill>
+                    <a:blip r:embed="rId11" cstate="none"/>
+                    <a:srcRect/>
+                    <a:stretch>
+                      <a:fillRect/>
+                    </a:stretch>
+                  </pic:blipFill>
+                  <pic:spPr bwMode="auto">
+                    <a:xfrm>
+                      <a:off x="0" y="0"/>
+                      <a:ext cx="2381250" cy="2828925"/>
                     </a:xfrm>
                     <a:prstGeom prst="rect">
                       <a:avLst/>

</xml_diff>

<commit_message>
feat: doi giao dien theo mau vang - trang - chu den dam
- nen vang, khung man hinh trang vien den co thanh tieu de 3 cham

- chu doi sang in hoa, dung Segoe UI Black qua SysFont

- nut chanh nhat ve bang 2 rect lech 4px tao do bong, hover doi mau

- the nguoi choi: dang den luot nen den chu vang, chua den luot nen trang

- o re chuot doi mau vang nhat de thay tren nen trang

- sua bo cuc: dong trang thai khong con de luoi, chu nut khong con sat vien

- viet lai bao cao Word: them muc 3.6/3.7/3.8, cap nhat 18 chi danh dau file
</commit_message>
<xml_diff>
--- a/docs/Bai-8-TicTacToe.docx
+++ b/docs/Bai-8-TicTacToe.docx
@@ -138,6 +138,19 @@
         <w:spacing w:after="60"/>
       </w:pPr>
       <w:r>
+        <w:t xml:space="preserve">Giao diện theo mẫu tham khảo: nền vàng, khung màn hình trắng viền đen có thanh tiêu đề ba chấm, chữ in hoa đậm, nút màu chanh nhạt có đổ bóng.</w:t>
+      </w:r>
+    </w:p>
+    <w:p>
+      <w:pPr>
+        <w:pStyle w:val="ListParagraph"/>
+        <w:numPr>
+          <w:ilvl w:val="0"/>
+          <w:numId w:val="2"/>
+        </w:numPr>
+        <w:spacing w:after="60"/>
+      </w:pPr>
+      <w:r>
         <w:t xml:space="preserve">Không dùng bất kỳ tệp hình ảnh hay tệp font (.ttf) nào; mọi hình khối đều vẽ bằng hàm hình học của pygame.</w:t>
       </w:r>
     </w:p>
@@ -273,7 +286,7 @@
           <w:sz w:val="18"/>
           <w:szCs w:val="18"/>
         </w:rPr>
-        <w:t xml:space="preserve">tictactoe.py:17-37 (khai bao hang so) va tictactoe.py:143-145 (tao hai nut)</w:t>
+        <w:t xml:space="preserve">tictactoe.py:17-39 (khai bao hang so) va tictactoe.py:160-161 (tao hai nut)</w:t>
       </w:r>
     </w:p>
     <w:p>
@@ -343,7 +356,7 @@
           <w:sz w:val="18"/>
           <w:szCs w:val="18"/>
         </w:rPr>
-        <w:t xml:space="preserve">tictactoe.py:74 - new_board()</w:t>
+        <w:t xml:space="preserve">tictactoe.py:86 - new_board()</w:t>
       </w:r>
     </w:p>
     <w:p>
@@ -481,7 +494,7 @@
           <w:sz w:val="18"/>
           <w:szCs w:val="18"/>
         </w:rPr>
-        <w:t xml:space="preserve">tictactoe.py:102 - cell_at(); tictactoe.py:92 - cell_rect() dung de ve o</w:t>
+        <w:t xml:space="preserve">tictactoe.py:114 - cell_at(); tictactoe.py:104 - cell_rect() dung de ve o</w:t>
       </w:r>
     </w:p>
     <w:p>
@@ -641,7 +654,7 @@
           <w:sz w:val="18"/>
           <w:szCs w:val="18"/>
         </w:rPr>
-        <w:t xml:space="preserve">tictactoe.py:208 - play()</w:t>
+        <w:t xml:space="preserve">tictactoe.py:220 - play()</w:t>
       </w:r>
     </w:p>
     <w:p>
@@ -846,7 +859,7 @@
           <w:sz w:val="18"/>
           <w:szCs w:val="18"/>
         </w:rPr>
-        <w:t xml:space="preserve">tictactoe.py:59 - WIN_LINES; tictactoe.py:79 - check_win()</w:t>
+        <w:t xml:space="preserve">tictactoe.py:70 - WIN_LINES; tictactoe.py:91 - check_win()</w:t>
       </w:r>
     </w:p>
     <w:p>
@@ -1021,7 +1034,7 @@
           <w:sz w:val="18"/>
           <w:szCs w:val="18"/>
         </w:rPr>
-        <w:t xml:space="preserve">tictactoe.py:215-225 - play(); tictactoe.py:87 - is_full()</w:t>
+        <w:t xml:space="preserve">tictactoe.py:227-237 - play(); tictactoe.py:99 - is_full()</w:t>
       </w:r>
     </w:p>
     <w:p>
@@ -1241,7 +1254,7 @@
           <w:sz w:val="18"/>
           <w:szCs w:val="18"/>
         </w:rPr>
-        <w:t xml:space="preserve">tictactoe.py:202 - _button_at(); tictactoe.py:180 - handle_event()</w:t>
+        <w:t xml:space="preserve">tictactoe.py:214 - _button_at(); tictactoe.py:192 - handle_event()</w:t>
       </w:r>
     </w:p>
     <w:p>
@@ -1443,7 +1456,7 @@
           <w:sz w:val="18"/>
           <w:szCs w:val="18"/>
         </w:rPr>
-        <w:t xml:space="preserve">tictactoe.py:293 - main()</w:t>
+        <w:t xml:space="preserve">tictactoe.py:318 - main()</w:t>
       </w:r>
     </w:p>
     <w:p>
@@ -1600,7 +1613,7 @@
                 <w:b w:val="false"/>
                 <w:bCs w:val="false"/>
               </w:rPr>
-              <w:t xml:space="preserve">Nền trắng</w:t>
+              <w:t xml:space="preserve">Nền vàng toàn cửa sổ</w:t>
             </w:r>
           </w:p>
         </w:tc>
@@ -1658,7 +1671,185 @@
                 <w:b w:val="false"/>
                 <w:bCs w:val="false"/>
               </w:rPr>
-              <w:t xml:space="preserve">draw() - dòng 257</w:t>
+              <w:t xml:space="preserve">draw() - dòng 282</w:t>
+            </w:r>
+          </w:p>
+        </w:tc>
+      </w:tr>
+      <w:tr>
+        <w:tc>
+          <w:tcPr>
+            <w:tcW w:type="dxa" w:w="2900"/>
+            <w:tcBorders>
+              <w:top w:val="single" w:color="BFC7D1" w:sz="1"/>
+              <w:left w:val="single" w:color="BFC7D1" w:sz="1"/>
+              <w:bottom w:val="single" w:color="BFC7D1" w:sz="1"/>
+              <w:right w:val="single" w:color="BFC7D1" w:sz="1"/>
+            </w:tcBorders>
+            <w:tcMar>
+              <w:top w:type="dxa" w:w="80"/>
+              <w:left w:type="dxa" w:w="120"/>
+              <w:bottom w:type="dxa" w:w="80"/>
+              <w:right w:type="dxa" w:w="120"/>
+            </w:tcMar>
+          </w:tcPr>
+          <w:p>
+            <w:pPr>
+              <w:spacing w:after="0"/>
+            </w:pPr>
+            <w:r>
+              <w:rPr>
+                <w:b w:val="false"/>
+                <w:bCs w:val="false"/>
+              </w:rPr>
+              <w:t xml:space="preserve">Khung màn hình trắng viền đen</w:t>
+            </w:r>
+          </w:p>
+        </w:tc>
+        <w:tc>
+          <w:tcPr>
+            <w:tcW w:type="dxa" w:w="3100"/>
+            <w:tcBorders>
+              <w:top w:val="single" w:color="BFC7D1" w:sz="1"/>
+              <w:left w:val="single" w:color="BFC7D1" w:sz="1"/>
+              <w:bottom w:val="single" w:color="BFC7D1" w:sz="1"/>
+              <w:right w:val="single" w:color="BFC7D1" w:sz="1"/>
+            </w:tcBorders>
+            <w:tcMar>
+              <w:top w:type="dxa" w:w="80"/>
+              <w:left w:type="dxa" w:w="120"/>
+              <w:bottom w:type="dxa" w:w="80"/>
+              <w:right w:type="dxa" w:w="120"/>
+            </w:tcMar>
+          </w:tcPr>
+          <w:p>
+            <w:pPr>
+              <w:spacing w:after="0"/>
+            </w:pPr>
+            <w:r>
+              <w:rPr>
+                <w:b w:val="false"/>
+                <w:bCs w:val="false"/>
+              </w:rPr>
+              <w:t xml:space="preserve">pygame.draw.rect</w:t>
+            </w:r>
+          </w:p>
+        </w:tc>
+        <w:tc>
+          <w:tcPr>
+            <w:tcW w:type="dxa" w:w="3026"/>
+            <w:tcBorders>
+              <w:top w:val="single" w:color="BFC7D1" w:sz="1"/>
+              <w:left w:val="single" w:color="BFC7D1" w:sz="1"/>
+              <w:bottom w:val="single" w:color="BFC7D1" w:sz="1"/>
+              <w:right w:val="single" w:color="BFC7D1" w:sz="1"/>
+            </w:tcBorders>
+            <w:tcMar>
+              <w:top w:type="dxa" w:w="80"/>
+              <w:left w:type="dxa" w:w="120"/>
+              <w:bottom w:type="dxa" w:w="80"/>
+              <w:right w:type="dxa" w:w="120"/>
+            </w:tcMar>
+          </w:tcPr>
+          <w:p>
+            <w:pPr>
+              <w:spacing w:after="0"/>
+            </w:pPr>
+            <w:r>
+              <w:rPr>
+                <w:b w:val="false"/>
+                <w:bCs w:val="false"/>
+              </w:rPr>
+              <w:t xml:space="preserve">_screen_frame() - dòng 270</w:t>
+            </w:r>
+          </w:p>
+        </w:tc>
+      </w:tr>
+      <w:tr>
+        <w:tc>
+          <w:tcPr>
+            <w:tcW w:type="dxa" w:w="2900"/>
+            <w:tcBorders>
+              <w:top w:val="single" w:color="BFC7D1" w:sz="1"/>
+              <w:left w:val="single" w:color="BFC7D1" w:sz="1"/>
+              <w:bottom w:val="single" w:color="BFC7D1" w:sz="1"/>
+              <w:right w:val="single" w:color="BFC7D1" w:sz="1"/>
+            </w:tcBorders>
+            <w:tcMar>
+              <w:top w:type="dxa" w:w="80"/>
+              <w:left w:type="dxa" w:w="120"/>
+              <w:bottom w:type="dxa" w:w="80"/>
+              <w:right w:type="dxa" w:w="120"/>
+            </w:tcMar>
+          </w:tcPr>
+          <w:p>
+            <w:pPr>
+              <w:spacing w:after="0"/>
+            </w:pPr>
+            <w:r>
+              <w:rPr>
+                <w:b w:val="false"/>
+                <w:bCs w:val="false"/>
+              </w:rPr>
+              <w:t xml:space="preserve">Thanh tiêu đề ba chấm</w:t>
+            </w:r>
+          </w:p>
+        </w:tc>
+        <w:tc>
+          <w:tcPr>
+            <w:tcW w:type="dxa" w:w="3100"/>
+            <w:tcBorders>
+              <w:top w:val="single" w:color="BFC7D1" w:sz="1"/>
+              <w:left w:val="single" w:color="BFC7D1" w:sz="1"/>
+              <w:bottom w:val="single" w:color="BFC7D1" w:sz="1"/>
+              <w:right w:val="single" w:color="BFC7D1" w:sz="1"/>
+            </w:tcBorders>
+            <w:tcMar>
+              <w:top w:type="dxa" w:w="80"/>
+              <w:left w:type="dxa" w:w="120"/>
+              <w:bottom w:type="dxa" w:w="80"/>
+              <w:right w:type="dxa" w:w="120"/>
+            </w:tcMar>
+          </w:tcPr>
+          <w:p>
+            <w:pPr>
+              <w:spacing w:after="0"/>
+            </w:pPr>
+            <w:r>
+              <w:rPr>
+                <w:b w:val="false"/>
+                <w:bCs w:val="false"/>
+              </w:rPr>
+              <w:t xml:space="preserve">pygame.draw.circle + đường kẻ ngang</w:t>
+            </w:r>
+          </w:p>
+        </w:tc>
+        <w:tc>
+          <w:tcPr>
+            <w:tcW w:type="dxa" w:w="3026"/>
+            <w:tcBorders>
+              <w:top w:val="single" w:color="BFC7D1" w:sz="1"/>
+              <w:left w:val="single" w:color="BFC7D1" w:sz="1"/>
+              <w:bottom w:val="single" w:color="BFC7D1" w:sz="1"/>
+              <w:right w:val="single" w:color="BFC7D1" w:sz="1"/>
+            </w:tcBorders>
+            <w:tcMar>
+              <w:top w:type="dxa" w:w="80"/>
+              <w:left w:type="dxa" w:w="120"/>
+              <w:bottom w:type="dxa" w:w="80"/>
+              <w:right w:type="dxa" w:w="120"/>
+            </w:tcMar>
+          </w:tcPr>
+          <w:p>
+            <w:pPr>
+              <w:spacing w:after="0"/>
+            </w:pPr>
+            <w:r>
+              <w:rPr>
+                <w:b w:val="false"/>
+                <w:bCs w:val="false"/>
+              </w:rPr>
+              <w:t xml:space="preserve">_screen_frame() - dòng 274-279</w:t>
             </w:r>
           </w:p>
         </w:tc>
@@ -1747,7 +1938,7 @@
                 <w:b w:val="false"/>
                 <w:bCs w:val="false"/>
               </w:rPr>
-              <w:t xml:space="preserve">draw() - dòng 267-272</w:t>
+              <w:t xml:space="preserve">draw() - dòng 293-298</w:t>
             </w:r>
           </w:p>
         </w:tc>
@@ -1836,7 +2027,7 @@
                 <w:b w:val="false"/>
                 <w:bCs w:val="false"/>
               </w:rPr>
-              <w:t xml:space="preserve">draw_mark() - dòng 112</w:t>
+              <w:t xml:space="preserve">draw_mark() - dòng 124</w:t>
             </w:r>
           </w:p>
         </w:tc>
@@ -1925,7 +2116,7 @@
                 <w:b w:val="false"/>
                 <w:bCs w:val="false"/>
               </w:rPr>
-              <w:t xml:space="preserve">draw_mark() - dòng 121</w:t>
+              <w:t xml:space="preserve">draw_mark() - dòng 133</w:t>
             </w:r>
           </w:p>
         </w:tc>
@@ -2014,7 +2205,7 @@
                 <w:b w:val="false"/>
                 <w:bCs w:val="false"/>
               </w:rPr>
-              <w:t xml:space="preserve">draw_win_line() - dòng 125</w:t>
+              <w:t xml:space="preserve">draw_win_line() - dòng 137</w:t>
             </w:r>
           </w:p>
         </w:tc>
@@ -2074,7 +2265,7 @@
                 <w:b w:val="false"/>
                 <w:bCs w:val="false"/>
               </w:rPr>
-              <w:t xml:space="preserve">pygame.draw.rect</w:t>
+              <w:t xml:space="preserve">pygame.draw.rect màu vàng nhạt</w:t>
             </w:r>
           </w:p>
         </w:tc>
@@ -2103,7 +2294,7 @@
                 <w:b w:val="false"/>
                 <w:bCs w:val="false"/>
               </w:rPr>
-              <w:t xml:space="preserve">draw() - dòng 264-265</w:t>
+              <w:t xml:space="preserve">draw() - dòng 290-291</w:t>
             </w:r>
           </w:p>
         </w:tc>
@@ -2134,7 +2325,7 @@
                 <w:b w:val="false"/>
                 <w:bCs w:val="false"/>
               </w:rPr>
-              <w:t xml:space="preserve">Thẻ người chơi (khung vuông)</w:t>
+              <w:t xml:space="preserve">Thẻ người chơi</w:t>
             </w:r>
           </w:p>
         </w:tc>
@@ -2163,7 +2354,7 @@
                 <w:b w:val="false"/>
                 <w:bCs w:val="false"/>
               </w:rPr>
-              <w:t xml:space="preserve">pygame.draw.rect, viền đổi theo lượt</w:t>
+              <w:t xml:space="preserve">pygame.draw.rect, đảo màu theo lượt</w:t>
             </w:r>
           </w:p>
         </w:tc>
@@ -2192,7 +2383,7 @@
                 <w:b w:val="false"/>
                 <w:bCs w:val="false"/>
               </w:rPr>
-              <w:t xml:space="preserve">_panel() - dòng 239</w:t>
+              <w:t xml:space="preserve">_panel() - dòng 251</w:t>
             </w:r>
           </w:p>
         </w:tc>
@@ -2281,7 +2472,7 @@
                 <w:b w:val="false"/>
                 <w:bCs w:val="false"/>
               </w:rPr>
-              <w:t xml:space="preserve">_panel() - dòng 247</w:t>
+              <w:t xml:space="preserve">_panel() - dòng 259-260</w:t>
             </w:r>
           </w:p>
         </w:tc>
@@ -2370,7 +2561,7 @@
                 <w:b w:val="false"/>
                 <w:bCs w:val="false"/>
               </w:rPr>
-              <w:t xml:space="preserve">_text() - dòng 229</w:t>
+              <w:t xml:space="preserve">_text() - dòng 241</w:t>
             </w:r>
           </w:p>
         </w:tc>
@@ -2401,7 +2592,7 @@
                 <w:b w:val="false"/>
                 <w:bCs w:val="false"/>
               </w:rPr>
-              <w:t xml:space="preserve">Nút Chơi lại, Xóa điểm</w:t>
+              <w:t xml:space="preserve">Nút có đổ bóng</w:t>
             </w:r>
           </w:p>
         </w:tc>
@@ -2430,7 +2621,7 @@
                 <w:b w:val="false"/>
                 <w:bCs w:val="false"/>
               </w:rPr>
-              <w:t xml:space="preserve">pygame.draw.rect vuông góc</w:t>
+              <w:t xml:space="preserve">hai pygame.draw.rect lệch nhau 4px</w:t>
             </w:r>
           </w:p>
         </w:tc>
@@ -2459,7 +2650,7 @@
                 <w:b w:val="false"/>
                 <w:bCs w:val="false"/>
               </w:rPr>
-              <w:t xml:space="preserve">_button() - dòng 250</w:t>
+              <w:t xml:space="preserve">_button() - dòng 262</w:t>
             </w:r>
           </w:p>
         </w:tc>
@@ -2912,7 +3103,7 @@
           <w:sz w:val="18"/>
           <w:szCs w:val="18"/>
         </w:rPr>
-        <w:t xml:space="preserve">tictactoe.py:239 - _panel(); tictactoe.py:261-262 - draw() goi hai the</w:t>
+        <w:t xml:space="preserve">tictactoe.py:251 - _panel(); tictactoe.py:285-288 - draw() goi hai the</w:t>
       </w:r>
     </w:p>
     <w:p>
@@ -3157,7 +3348,7 @@
           <w:sz w:val="18"/>
           <w:szCs w:val="18"/>
         </w:rPr>
-        <w:t xml:space="preserve">tictactoe.py:70 - FONT_NAMES; tictactoe.py:151 - _font()</w:t>
+        <w:t xml:space="preserve">tictactoe.py:82 - FONT_BOLD; tictactoe.py:163 - _font()</w:t>
       </w:r>
     </w:p>
     <w:p>
@@ -3165,7 +3356,7 @@
         <w:pStyle w:val="Heading2"/>
       </w:pPr>
       <w:r>
-        <w:t xml:space="preserve">3.6. Bảng màu của giao diện</w:t>
+        <w:t xml:space="preserve">3.6. Khung màn hình và thanh tiêu đề</w:t>
       </w:r>
     </w:p>
     <w:p>
@@ -3173,112 +3364,142 @@
         <w:spacing w:after="120"/>
       </w:pPr>
       <w:r>
-        <w:t xml:space="preserve">Nền trắng, các khung vuông góc, màu chủ đạo lấy từ màu của hai quân để người chơi nhận diện bên nào là bên nào.</w:t>
-      </w:r>
-    </w:p>
-    <w:p>
-      <w:pPr>
-        <w:shd w:fill="F4F6F8" w:val="clear"/>
-        <w:spacing w:after="0" w:line="240"/>
-        <w:ind w:left="200"/>
-      </w:pPr>
-      <w:r>
-        <w:rPr>
-          <w:rFonts w:ascii="Consolas" w:cs="Consolas" w:eastAsia="Consolas" w:hAnsi="Consolas"/>
-          <w:sz w:val="18"/>
-          <w:szCs w:val="18"/>
-        </w:rPr>
-        <w:t xml:space="preserve">BG_COLOR     = (247, 249, 252)   # nen trang</w:t>
-      </w:r>
-    </w:p>
-    <w:p>
-      <w:pPr>
-        <w:shd w:fill="F4F6F8" w:val="clear"/>
-        <w:spacing w:after="0" w:line="240"/>
-        <w:ind w:left="200"/>
-      </w:pPr>
-      <w:r>
-        <w:rPr>
-          <w:rFonts w:ascii="Consolas" w:cs="Consolas" w:eastAsia="Consolas" w:hAnsi="Consolas"/>
-          <w:sz w:val="18"/>
-          <w:szCs w:val="18"/>
-        </w:rPr>
-        <w:t xml:space="preserve">PANEL_COLOR  = (233, 238, 245)   # the nguoi choi chua den luot</w:t>
-      </w:r>
-    </w:p>
-    <w:p>
-      <w:pPr>
-        <w:shd w:fill="F4F6F8" w:val="clear"/>
-        <w:spacing w:after="0" w:line="240"/>
-        <w:ind w:left="200"/>
-      </w:pPr>
-      <w:r>
-        <w:rPr>
-          <w:rFonts w:ascii="Consolas" w:cs="Consolas" w:eastAsia="Consolas" w:hAnsi="Consolas"/>
-          <w:sz w:val="18"/>
-          <w:szCs w:val="18"/>
-        </w:rPr>
-        <w:t xml:space="preserve">PANEL_ACTIVE = (214, 227, 244)   # the nguoi choi dang den luot</w:t>
-      </w:r>
-    </w:p>
-    <w:p>
-      <w:pPr>
-        <w:shd w:fill="F4F6F8" w:val="clear"/>
-        <w:spacing w:after="0" w:line="240"/>
-        <w:ind w:left="200"/>
-      </w:pPr>
-      <w:r>
-        <w:rPr>
-          <w:rFonts w:ascii="Consolas" w:cs="Consolas" w:eastAsia="Consolas" w:hAnsi="Consolas"/>
-          <w:sz w:val="18"/>
-          <w:szCs w:val="18"/>
-        </w:rPr>
-        <w:t xml:space="preserve">GRID_COLOR   = (150, 163, 182)   # duong ke ban co</w:t>
-      </w:r>
-    </w:p>
-    <w:p>
-      <w:pPr>
-        <w:shd w:fill="F4F6F8" w:val="clear"/>
-        <w:spacing w:after="0" w:line="240"/>
-        <w:ind w:left="200"/>
-      </w:pPr>
-      <w:r>
-        <w:rPr>
-          <w:rFonts w:ascii="Consolas" w:cs="Consolas" w:eastAsia="Consolas" w:hAnsi="Consolas"/>
-          <w:sz w:val="18"/>
-          <w:szCs w:val="18"/>
-        </w:rPr>
-        <w:t xml:space="preserve">WIN_COLOR    = (22, 150, 92)     # duong thang</w:t>
-      </w:r>
-    </w:p>
-    <w:p>
-      <w:pPr>
-        <w:shd w:fill="F4F6F8" w:val="clear"/>
-        <w:spacing w:after="0" w:line="240"/>
-        <w:ind w:left="200"/>
-      </w:pPr>
-      <w:r>
-        <w:rPr>
-          <w:rFonts w:ascii="Consolas" w:cs="Consolas" w:eastAsia="Consolas" w:hAnsi="Consolas"/>
-          <w:sz w:val="18"/>
-          <w:szCs w:val="18"/>
-        </w:rPr>
-        <w:t xml:space="preserve">X_COLOR      = (37, 99, 235)     # quan X</w:t>
-      </w:r>
-    </w:p>
-    <w:p>
-      <w:pPr>
-        <w:shd w:fill="F4F6F8" w:val="clear"/>
-        <w:spacing w:after="0" w:line="240"/>
-        <w:ind w:left="200"/>
-      </w:pPr>
-      <w:r>
-        <w:rPr>
-          <w:rFonts w:ascii="Consolas" w:cs="Consolas" w:eastAsia="Consolas" w:hAnsi="Consolas"/>
-          <w:sz w:val="18"/>
-          <w:szCs w:val="18"/>
-        </w:rPr>
-        <w:t xml:space="preserve">O_COLOR      = (217, 96, 16)     # quan O</w:t>
+        <w:t xml:space="preserve">Toàn bộ phần bàn chơi nằm trong một khung trắng viền đen, bên ngoài là nền vàng. Đầu khung có một thanh tiêu đề với ba chấm tròn mô phỏng cửa sổ ứng dụng, đúng như mẫu tham khảo.</w:t>
+      </w:r>
+    </w:p>
+    <w:p>
+      <w:pPr>
+        <w:shd w:fill="F4F6F8" w:val="clear"/>
+        <w:spacing w:after="0" w:line="240"/>
+        <w:ind w:left="200"/>
+      </w:pPr>
+      <w:r>
+        <w:rPr>
+          <w:rFonts w:ascii="Consolas" w:cs="Consolas" w:eastAsia="Consolas" w:hAnsi="Consolas"/>
+          <w:sz w:val="18"/>
+          <w:szCs w:val="18"/>
+        </w:rPr>
+        <w:t xml:space="preserve">def _screen_frame(self):</w:t>
+      </w:r>
+    </w:p>
+    <w:p>
+      <w:pPr>
+        <w:shd w:fill="F4F6F8" w:val="clear"/>
+        <w:spacing w:after="0" w:line="240"/>
+        <w:ind w:left="200"/>
+      </w:pPr>
+      <w:r>
+        <w:rPr>
+          <w:rFonts w:ascii="Consolas" w:cs="Consolas" w:eastAsia="Consolas" w:hAnsi="Consolas"/>
+          <w:sz w:val="18"/>
+          <w:szCs w:val="18"/>
+        </w:rPr>
+        <w:t xml:space="preserve">    pygame.draw.rect(self.screen, SCREEN_COLOR, SCREEN)</w:t>
+      </w:r>
+    </w:p>
+    <w:p>
+      <w:pPr>
+        <w:shd w:fill="F4F6F8" w:val="clear"/>
+        <w:spacing w:after="0" w:line="240"/>
+        <w:ind w:left="200"/>
+      </w:pPr>
+      <w:r>
+        <w:rPr>
+          <w:rFonts w:ascii="Consolas" w:cs="Consolas" w:eastAsia="Consolas" w:hAnsi="Consolas"/>
+          <w:sz w:val="18"/>
+          <w:szCs w:val="18"/>
+        </w:rPr>
+        <w:t xml:space="preserve">    pygame.draw.rect(self.screen, INK, SCREEN, width=3)</w:t>
+      </w:r>
+    </w:p>
+    <w:p>
+      <w:pPr>
+        <w:shd w:fill="F4F6F8" w:val="clear"/>
+        <w:spacing w:after="0" w:line="240"/>
+        <w:ind w:left="200"/>
+      </w:pPr>
+      <w:r>
+        <w:rPr>
+          <w:rFonts w:ascii="Consolas" w:cs="Consolas" w:eastAsia="Consolas" w:hAnsi="Consolas"/>
+          <w:sz w:val="18"/>
+          <w:szCs w:val="18"/>
+        </w:rPr>
+        <w:t xml:space="preserve">    pygame.draw.line(self.screen, INK, (SCREEN.x, SCREEN.y + TITLE_H),</w:t>
+      </w:r>
+    </w:p>
+    <w:p>
+      <w:pPr>
+        <w:shd w:fill="F4F6F8" w:val="clear"/>
+        <w:spacing w:after="0" w:line="240"/>
+        <w:ind w:left="200"/>
+      </w:pPr>
+      <w:r>
+        <w:rPr>
+          <w:rFonts w:ascii="Consolas" w:cs="Consolas" w:eastAsia="Consolas" w:hAnsi="Consolas"/>
+          <w:sz w:val="18"/>
+          <w:szCs w:val="18"/>
+        </w:rPr>
+        <w:t xml:space="preserve">                     (SCREEN.right, SCREEN.y + TITLE_H), 3)</w:t>
+      </w:r>
+    </w:p>
+    <w:p>
+      <w:pPr>
+        <w:shd w:fill="F4F6F8" w:val="clear"/>
+        <w:spacing w:after="0" w:line="240"/>
+        <w:ind w:left="200"/>
+      </w:pPr>
+      <w:r>
+        <w:rPr>
+          <w:rFonts w:ascii="Consolas" w:cs="Consolas" w:eastAsia="Consolas" w:hAnsi="Consolas"/>
+          <w:sz w:val="18"/>
+          <w:szCs w:val="18"/>
+        </w:rPr>
+        <w:t xml:space="preserve">    cy = SCREEN.y + TITLE_H // 2</w:t>
+      </w:r>
+    </w:p>
+    <w:p>
+      <w:pPr>
+        <w:shd w:fill="F4F6F8" w:val="clear"/>
+        <w:spacing w:after="0" w:line="240"/>
+        <w:ind w:left="200"/>
+      </w:pPr>
+      <w:r>
+        <w:rPr>
+          <w:rFonts w:ascii="Consolas" w:cs="Consolas" w:eastAsia="Consolas" w:hAnsi="Consolas"/>
+          <w:sz w:val="18"/>
+          <w:szCs w:val="18"/>
+        </w:rPr>
+        <w:t xml:space="preserve">    for index, color in enumerate(((241,233,76), (255,255,255), (176,188,0))):</w:t>
+      </w:r>
+    </w:p>
+    <w:p>
+      <w:pPr>
+        <w:shd w:fill="F4F6F8" w:val="clear"/>
+        <w:spacing w:after="0" w:line="240"/>
+        <w:ind w:left="200"/>
+      </w:pPr>
+      <w:r>
+        <w:rPr>
+          <w:rFonts w:ascii="Consolas" w:cs="Consolas" w:eastAsia="Consolas" w:hAnsi="Consolas"/>
+          <w:sz w:val="18"/>
+          <w:szCs w:val="18"/>
+        </w:rPr>
+        <w:t xml:space="preserve">        pygame.draw.circle(self.screen, color, (SCREEN.x + 18 + index*20, cy), 6)</w:t>
+      </w:r>
+    </w:p>
+    <w:p>
+      <w:pPr>
+        <w:shd w:fill="F4F6F8" w:val="clear"/>
+        <w:spacing w:after="0" w:line="240"/>
+        <w:ind w:left="200"/>
+      </w:pPr>
+      <w:r>
+        <w:rPr>
+          <w:rFonts w:ascii="Consolas" w:cs="Consolas" w:eastAsia="Consolas" w:hAnsi="Consolas"/>
+          <w:sz w:val="18"/>
+          <w:szCs w:val="18"/>
+        </w:rPr>
+        <w:t xml:space="preserve">        pygame.draw.circle(self.screen, INK, (SCREEN.x + 18 + index*20, cy), 6, 2)</w:t>
       </w:r>
     </w:p>
     <w:p>
@@ -3302,7 +3523,342 @@
           <w:sz w:val="18"/>
           <w:szCs w:val="18"/>
         </w:rPr>
-        <w:t xml:space="preserve">tictactoe.py:39-53 - khai bao bang mau</w:t>
+        <w:t xml:space="preserve">tictactoe.py:270 - _screen_frame()</w:t>
+      </w:r>
+    </w:p>
+    <w:p>
+      <w:pPr>
+        <w:pStyle w:val="Heading2"/>
+      </w:pPr>
+      <w:r>
+        <w:t xml:space="preserve">3.7. Nút có đổ bóng</w:t>
+      </w:r>
+    </w:p>
+    <w:p>
+      <w:pPr>
+        <w:spacing w:after="120"/>
+      </w:pPr>
+      <w:r>
+        <w:t xml:space="preserve">Nút được vẽ bằng hai hình chữ nhật lệch nhau 4 pixel: hình phía sau màu đen tạo cảm giác đổ bông, hình phía trước là mặt nút màu chanh nhạt, rồi viền đen 3 pixel và chữ in hoa đậm.</w:t>
+      </w:r>
+    </w:p>
+    <w:p>
+      <w:pPr>
+        <w:shd w:fill="F4F6F8" w:val="clear"/>
+        <w:spacing w:after="0" w:line="240"/>
+        <w:ind w:left="200"/>
+      </w:pPr>
+      <w:r>
+        <w:rPr>
+          <w:rFonts w:ascii="Consolas" w:cs="Consolas" w:eastAsia="Consolas" w:hAnsi="Consolas"/>
+          <w:sz w:val="18"/>
+          <w:szCs w:val="18"/>
+        </w:rPr>
+        <w:t xml:space="preserve">def _button(self, rect, label):</w:t>
+      </w:r>
+    </w:p>
+    <w:p>
+      <w:pPr>
+        <w:shd w:fill="F4F6F8" w:val="clear"/>
+        <w:spacing w:after="0" w:line="240"/>
+        <w:ind w:left="200"/>
+      </w:pPr>
+      <w:r>
+        <w:rPr>
+          <w:rFonts w:ascii="Consolas" w:cs="Consolas" w:eastAsia="Consolas" w:hAnsi="Consolas"/>
+          <w:sz w:val="18"/>
+          <w:szCs w:val="18"/>
+        </w:rPr>
+        <w:t xml:space="preserve">    is_hover = rect == self.hover_button</w:t>
+      </w:r>
+    </w:p>
+    <w:p>
+      <w:pPr>
+        <w:shd w:fill="F4F6F8" w:val="clear"/>
+        <w:spacing w:after="0" w:line="240"/>
+        <w:ind w:left="200"/>
+      </w:pPr>
+      <w:r>
+        <w:rPr>
+          <w:rFonts w:ascii="Consolas" w:cs="Consolas" w:eastAsia="Consolas" w:hAnsi="Consolas"/>
+          <w:sz w:val="18"/>
+          <w:szCs w:val="18"/>
+        </w:rPr>
+        <w:t xml:space="preserve">    shadow = rect.move(4, 4)                 # hinh phia sau tao bong</w:t>
+      </w:r>
+    </w:p>
+    <w:p>
+      <w:pPr>
+        <w:shd w:fill="F4F6F8" w:val="clear"/>
+        <w:spacing w:after="0" w:line="240"/>
+        <w:ind w:left="200"/>
+      </w:pPr>
+      <w:r>
+        <w:rPr>
+          <w:rFonts w:ascii="Consolas" w:cs="Consolas" w:eastAsia="Consolas" w:hAnsi="Consolas"/>
+          <w:sz w:val="18"/>
+          <w:szCs w:val="18"/>
+        </w:rPr>
+        <w:t xml:space="preserve">    pygame.draw.rect(self.screen, SHADOW_COLOR, shadow)</w:t>
+      </w:r>
+    </w:p>
+    <w:p>
+      <w:pPr>
+        <w:shd w:fill="F4F6F8" w:val="clear"/>
+        <w:spacing w:after="0" w:line="240"/>
+        <w:ind w:left="200"/>
+      </w:pPr>
+      <w:r>
+        <w:rPr>
+          <w:rFonts w:ascii="Consolas" w:cs="Consolas" w:eastAsia="Consolas" w:hAnsi="Consolas"/>
+          <w:sz w:val="18"/>
+          <w:szCs w:val="18"/>
+        </w:rPr>
+        <w:t xml:space="preserve">    pygame.draw.rect(self.screen, BTN_HOVER if is_hover else BTN_COLOR, rect)</w:t>
+      </w:r>
+    </w:p>
+    <w:p>
+      <w:pPr>
+        <w:shd w:fill="F4F6F8" w:val="clear"/>
+        <w:spacing w:after="0" w:line="240"/>
+        <w:ind w:left="200"/>
+      </w:pPr>
+      <w:r>
+        <w:rPr>
+          <w:rFonts w:ascii="Consolas" w:cs="Consolas" w:eastAsia="Consolas" w:hAnsi="Consolas"/>
+          <w:sz w:val="18"/>
+          <w:szCs w:val="18"/>
+        </w:rPr>
+        <w:t xml:space="preserve">    pygame.draw.rect(self.screen, INK, rect, width=3)</w:t>
+      </w:r>
+    </w:p>
+    <w:p>
+      <w:pPr>
+        <w:shd w:fill="F4F6F8" w:val="clear"/>
+        <w:spacing w:after="0" w:line="240"/>
+        <w:ind w:left="200"/>
+      </w:pPr>
+      <w:r>
+        <w:rPr>
+          <w:rFonts w:ascii="Consolas" w:cs="Consolas" w:eastAsia="Consolas" w:hAnsi="Consolas"/>
+          <w:sz w:val="18"/>
+          <w:szCs w:val="18"/>
+        </w:rPr>
+        <w:t xml:space="preserve">    self._text("button", label, BTN_TEXT, rect.center)</w:t>
+      </w:r>
+    </w:p>
+    <w:p>
+      <w:pPr>
+        <w:spacing w:after="200" w:before="40"/>
+      </w:pPr>
+      <w:r>
+        <w:rPr>
+          <w:b/>
+          <w:bCs/>
+          <w:color w:val="7F7F7F"/>
+          <w:sz w:val="18"/>
+          <w:szCs w:val="18"/>
+        </w:rPr>
+        <w:t xml:space="preserve">Nguồn: </w:t>
+      </w:r>
+      <w:r>
+        <w:rPr>
+          <w:rFonts w:ascii="Consolas" w:cs="Consolas" w:eastAsia="Consolas" w:hAnsi="Consolas"/>
+          <w:color w:val="7F7F7F"/>
+          <w:sz w:val="18"/>
+          <w:szCs w:val="18"/>
+        </w:rPr>
+        <w:t xml:space="preserve">tictactoe.py:262 - _button()</w:t>
+      </w:r>
+    </w:p>
+    <w:p>
+      <w:pPr>
+        <w:pStyle w:val="Heading2"/>
+      </w:pPr>
+      <w:r>
+        <w:t xml:space="preserve">3.8. Bảng màu của giao diện</w:t>
+      </w:r>
+    </w:p>
+    <w:p>
+      <w:pPr>
+        <w:spacing w:after="120"/>
+      </w:pPr>
+      <w:r>
+        <w:t xml:space="preserve">Nền trắng, các khung vuông góc, màu chủ đạo lấy từ màu của hai quân để người chơi nhận diện bên nào là bên nào.</w:t>
+      </w:r>
+    </w:p>
+    <w:p>
+      <w:pPr>
+        <w:shd w:fill="F4F6F8" w:val="clear"/>
+        <w:spacing w:after="0" w:line="240"/>
+        <w:ind w:left="200"/>
+      </w:pPr>
+      <w:r>
+        <w:rPr>
+          <w:rFonts w:ascii="Consolas" w:cs="Consolas" w:eastAsia="Consolas" w:hAnsi="Consolas"/>
+          <w:sz w:val="18"/>
+          <w:szCs w:val="18"/>
+        </w:rPr>
+        <w:t xml:space="preserve">BG_COLOR      = (241, 233, 76)   # nen vang ben ngoai khung</w:t>
+      </w:r>
+    </w:p>
+    <w:p>
+      <w:pPr>
+        <w:shd w:fill="F4F6F8" w:val="clear"/>
+        <w:spacing w:after="0" w:line="240"/>
+        <w:ind w:left="200"/>
+      </w:pPr>
+      <w:r>
+        <w:rPr>
+          <w:rFonts w:ascii="Consolas" w:cs="Consolas" w:eastAsia="Consolas" w:hAnsi="Consolas"/>
+          <w:sz w:val="18"/>
+          <w:szCs w:val="18"/>
+        </w:rPr>
+        <w:t xml:space="preserve">SCREEN_COLOR  = (255, 255, 255)   # khung man hinh trang</w:t>
+      </w:r>
+    </w:p>
+    <w:p>
+      <w:pPr>
+        <w:shd w:fill="F4F6F8" w:val="clear"/>
+        <w:spacing w:after="0" w:line="240"/>
+        <w:ind w:left="200"/>
+      </w:pPr>
+      <w:r>
+        <w:rPr>
+          <w:rFonts w:ascii="Consolas" w:cs="Consolas" w:eastAsia="Consolas" w:hAnsi="Consolas"/>
+          <w:sz w:val="18"/>
+          <w:szCs w:val="18"/>
+        </w:rPr>
+        <w:t xml:space="preserve">INK           = (23, 23, 42)     # chu den dam, dung chung cho luoi va nhan</w:t>
+      </w:r>
+    </w:p>
+    <w:p>
+      <w:pPr>
+        <w:shd w:fill="F4F6F8" w:val="clear"/>
+        <w:spacing w:after="0" w:line="240"/>
+        <w:ind w:left="200"/>
+      </w:pPr>
+      <w:r>
+        <w:rPr>
+          <w:rFonts w:ascii="Consolas" w:cs="Consolas" w:eastAsia="Consolas" w:hAnsi="Consolas"/>
+          <w:sz w:val="18"/>
+          <w:szCs w:val="18"/>
+        </w:rPr>
+        <w:t xml:space="preserve">CARD_COLOR    = (255, 255, 255)   # the nguoi choi chua den luot</w:t>
+      </w:r>
+    </w:p>
+    <w:p>
+      <w:pPr>
+        <w:shd w:fill="F4F6F8" w:val="clear"/>
+        <w:spacing w:after="0" w:line="240"/>
+        <w:ind w:left="200"/>
+      </w:pPr>
+      <w:r>
+        <w:rPr>
+          <w:rFonts w:ascii="Consolas" w:cs="Consolas" w:eastAsia="Consolas" w:hAnsi="Consolas"/>
+          <w:sz w:val="18"/>
+          <w:szCs w:val="18"/>
+        </w:rPr>
+        <w:t xml:space="preserve">CARD_ACTIVE   = INK              # the nguoi choi dang den luot: nen den, chu vang</w:t>
+      </w:r>
+    </w:p>
+    <w:p>
+      <w:pPr>
+        <w:shd w:fill="F4F6F8" w:val="clear"/>
+        <w:spacing w:after="0" w:line="240"/>
+        <w:ind w:left="200"/>
+      </w:pPr>
+      <w:r>
+        <w:rPr>
+          <w:rFonts w:ascii="Consolas" w:cs="Consolas" w:eastAsia="Consolas" w:hAnsi="Consolas"/>
+          <w:sz w:val="18"/>
+          <w:szCs w:val="18"/>
+        </w:rPr>
+        <w:t xml:space="preserve">HOVER_COLOR   = (250, 249, 205)   # o ban co dang re chuot</w:t>
+      </w:r>
+    </w:p>
+    <w:p>
+      <w:pPr>
+        <w:shd w:fill="F4F6F8" w:val="clear"/>
+        <w:spacing w:after="0" w:line="240"/>
+        <w:ind w:left="200"/>
+      </w:pPr>
+      <w:r>
+        <w:rPr>
+          <w:rFonts w:ascii="Consolas" w:cs="Consolas" w:eastAsia="Consolas" w:hAnsi="Consolas"/>
+          <w:sz w:val="18"/>
+          <w:szCs w:val="18"/>
+        </w:rPr>
+        <w:t xml:space="preserve">BTN_COLOR     = (214, 226, 0)    # mat nut</w:t>
+      </w:r>
+    </w:p>
+    <w:p>
+      <w:pPr>
+        <w:shd w:fill="F4F6F8" w:val="clear"/>
+        <w:spacing w:after="0" w:line="240"/>
+        <w:ind w:left="200"/>
+      </w:pPr>
+      <w:r>
+        <w:rPr>
+          <w:rFonts w:ascii="Consolas" w:cs="Consolas" w:eastAsia="Consolas" w:hAnsi="Consolas"/>
+          <w:sz w:val="18"/>
+          <w:szCs w:val="18"/>
+        </w:rPr>
+        <w:t xml:space="preserve">BTN_HOVER     = (176, 188, 0)    # mat nut khi re chuot vao</w:t>
+      </w:r>
+    </w:p>
+    <w:p>
+      <w:pPr>
+        <w:shd w:fill="F4F6F8" w:val="clear"/>
+        <w:spacing w:after="0" w:line="240"/>
+        <w:ind w:left="200"/>
+      </w:pPr>
+      <w:r>
+        <w:rPr>
+          <w:rFonts w:ascii="Consolas" w:cs="Consolas" w:eastAsia="Consolas" w:hAnsi="Consolas"/>
+          <w:sz w:val="18"/>
+          <w:szCs w:val="18"/>
+        </w:rPr>
+        <w:t xml:space="preserve">X_COLOR       = INK              # quan X</w:t>
+      </w:r>
+    </w:p>
+    <w:p>
+      <w:pPr>
+        <w:shd w:fill="F4F6F8" w:val="clear"/>
+        <w:spacing w:after="0" w:line="240"/>
+        <w:ind w:left="200"/>
+      </w:pPr>
+      <w:r>
+        <w:rPr>
+          <w:rFonts w:ascii="Consolas" w:cs="Consolas" w:eastAsia="Consolas" w:hAnsi="Consolas"/>
+          <w:sz w:val="18"/>
+          <w:szCs w:val="18"/>
+        </w:rPr>
+        <w:t xml:space="preserve">O_COLOR       = (198, 40, 62)    # quan O</w:t>
+      </w:r>
+    </w:p>
+    <w:p>
+      <w:pPr>
+        <w:spacing w:after="200" w:before="40"/>
+      </w:pPr>
+      <w:r>
+        <w:rPr>
+          <w:b/>
+          <w:bCs/>
+          <w:color w:val="7F7F7F"/>
+          <w:sz w:val="18"/>
+          <w:szCs w:val="18"/>
+        </w:rPr>
+        <w:t xml:space="preserve">Nguồn: </w:t>
+      </w:r>
+      <w:r>
+        <w:rPr>
+          <w:rFonts w:ascii="Consolas" w:cs="Consolas" w:eastAsia="Consolas" w:hAnsi="Consolas"/>
+          <w:color w:val="7F7F7F"/>
+          <w:sz w:val="18"/>
+          <w:szCs w:val="18"/>
+        </w:rPr>
+        <w:t xml:space="preserve">tictactoe.py:43-61 - khai bao bang mau</w:t>
       </w:r>
     </w:p>
     <w:p>

</xml_diff>

<commit_message>
refactor: bo phim R, chi dung nut bam de choi lai
- go nhanh K_r khoi handle_event, giu lai ESC/Q
- go khoi dong chu goi y 'R: CHOI LAI' tren man hinh
- selftest: thay test phim R bang van thang moi qua nut Choi lai
- cap nhat README, ghi chu thuat toan va sinh lai file Word cu
</commit_message>
<xml_diff>
--- a/docs/Bai-8-TicTacToe.docx
+++ b/docs/Bai-8-TicTacToe.docx
@@ -99,7 +99,7 @@
         <w:spacing w:after="60"/>
       </w:pPr>
       <w:r>
-        <w:t xml:space="preserve">Có nút chơi lại (và phím R) để bắt đầu ván mới.</w:t>
+        <w:t xml:space="preserve">Có nút chơi lại để bắt đầu ván mới.</w:t>
       </w:r>
     </w:p>
     <w:p>
@@ -1050,7 +1050,7 @@
         <w:spacing w:after="120"/>
       </w:pPr>
       <w:r>
-        <w:t xml:space="preserve">Hai nút là hai hình chữ nhật cố định. Khi rê chuột vào nút thì không tô ô bàn cờ, và khi bấm vào thì gọi reset() (xoá ván, giữ điểm) hoặc reset_scores() (xoá cả bảng điểm). Phím R thực hiện cùng tác vụ với nút Chơi lại.</w:t>
+        <w:t xml:space="preserve">Hai nút là hai hình chữ nhật cố định. Khi rê chuột vào nút thì không tô ô bàn cờ, và khi bấm vào thì gọi reset() (xoá ván, giữ điểm) hoặc reset_scores() (xoá cả bảng điểm).</w:t>
       </w:r>
     </w:p>
     <w:p>
@@ -4227,7 +4227,7 @@
         <w:spacing w:after="60"/>
       </w:pPr>
       <w:r>
-        <w:t xml:space="preserve">Phím R cho lại ván, phím ESC trả về giá trị yêu cầu thoát chương trình.</w:t>
+        <w:t xml:space="preserve">Phím ESC trả về giá trị yêu cầu thoát chương trình.</w:t>
       </w:r>
     </w:p>
     <w:p>
@@ -4272,7 +4272,7 @@
           <w:sz w:val="18"/>
           <w:szCs w:val="18"/>
         </w:rPr>
-        <w:t xml:space="preserve">OK  flow: click hop le / thang / hoa / khoa van / nut bam / R / xoa diem / ESC</w:t>
+        <w:t xml:space="preserve">OK  flow: click hop le / thang / hoa / khoa van / nut bam / xoa diem / ESC</w:t>
       </w:r>
     </w:p>
     <w:p>

</xml_diff>